<commit_message>
module 4 non IT : quiz d'ouverture dans le deck
- Diapo 4 : quiz vrai ou faux (8 affirmations)
- Diapo 77 : réponses commentées à la clôture
- Guide formateur : numéros de diapos recalés

Co-Authored-By: Claude Opus 5.5 <noreply@anthropic.com>
</commit_message>
<xml_diff>
--- a/module4_nonIT/M4-nonIT_Guide_formateur.docx
+++ b/module4_nonIT/M4-nonIT_Guide_formateur.docx
@@ -308,7 +308,7 @@
         </w:numPr>
       </w:pPr>
       <w:r>
-        <w:t>Vérifier dans les versions GRATUITES : Gemini Notebook (notebook.google.com, ex-NotebookLM), Gems et Deep Research (Gemini), Projets (Claude), accès gratuit à Grok, GPT personnalisés (ChatGPT). Les offres changent souvent : mettre à jour les diapos 16 à 19 et adapter le Lab 5 si besoin.</w:t>
+        <w:t>Vérifier dans les versions GRATUITES : Gemini Notebook (notebook.google.com, ex-NotebookLM), Gems et Deep Research (Gemini), Projets (Claude), accès gratuit à Grok, GPT personnalisés (ChatGPT). Les offres changent souvent : mettre à jour les diapos 17 à 20 et adapter le Lab 5 si besoin.</w:t>
       </w:r>
     </w:p>
     <w:p>
@@ -449,7 +449,7 @@
         </w:numPr>
       </w:pPr>
       <w:r>
-        <w:t>Au moment de choisir les pistes (diapo 4), placer les participantes par piste et mélanger les années de thèse dans chaque table. Repérer celles qui n'ont pas apporté de PDF ou de résumé : elles prennent les corpus de repli.</w:t>
+        <w:t>Au moment de choisir les pistes (diapo 5), placer les participantes par piste et mélanger les années de thèse dans chaque table. Repérer celles qui n'ont pas apporté de PDF ou de résumé : elles prennent les corpus de repli.</w:t>
       </w:r>
     </w:p>
     <w:p>
@@ -606,7 +606,6 @@
         <w:pageBreakBefore/>
       </w:pPr>
       <w:r>
-        <w:lastRenderedPageBreak/>
         <w:t>2. Conducteur minuté</w:t>
       </w:r>
     </w:p>
@@ -844,7 +843,7 @@
           </w:tcPr>
           <w:p>
             <w:r>
-              <w:t>Présentation, lien avec J2/J3, objectifs, quiz d'ouverture (annexe), choix des pistes.</w:t>
+              <w:t>Présentation, lien avec J2/J3, objectifs, quiz d'ouverture (diapo 4, corrigé en annexe), choix des pistes.</w:t>
             </w:r>
           </w:p>
         </w:tc>
@@ -866,7 +865,7 @@
           </w:tcPr>
           <w:p>
             <w:r>
-              <w:t>Diapos 1-4, cahier</w:t>
+              <w:t>Diapos 1-5, cahier</w:t>
             </w:r>
           </w:p>
         </w:tc>
@@ -948,7 +947,7 @@
           </w:tcPr>
           <w:p>
             <w:r>
-              <w:t>Définition de l'IA générative, user flow (diapo 7), complétion de phrase, hallucinations et cas réel de Dr Tiebekabe (diapo 10), mémoire, confidentialité.</w:t>
+              <w:t>Définition de l'IA générative, user flow (diapo 8), complétion de phrase, hallucinations et cas réel de Dr Tiebekabe (diapo 11), mémoire, confidentialité.</w:t>
             </w:r>
           </w:p>
         </w:tc>
@@ -970,7 +969,7 @@
           </w:tcPr>
           <w:p>
             <w:r>
-              <w:t>Diapos 5-13</w:t>
+              <w:t>Diapos 6-14</w:t>
             </w:r>
           </w:p>
         </w:tc>
@@ -1074,7 +1073,7 @@
           </w:tcPr>
           <w:p>
             <w:r>
-              <w:t>Diapos 14-21</w:t>
+              <w:t>Diapos 15-22</w:t>
             </w:r>
           </w:p>
         </w:tc>
@@ -1178,7 +1177,7 @@
           </w:tcPr>
           <w:p>
             <w:r>
-              <w:t>Diapo 22, Fiche 0</w:t>
+              <w:t>Diapo 23, Fiche 0</w:t>
             </w:r>
           </w:p>
         </w:tc>
@@ -1378,7 +1377,7 @@
           </w:tcPr>
           <w:p>
             <w:r>
-              <w:t>Diapos 23-34</w:t>
+              <w:t>Diapos 24-35</w:t>
             </w:r>
           </w:p>
         </w:tc>
@@ -1482,7 +1481,7 @@
           </w:tcPr>
           <w:p>
             <w:r>
-              <w:t>Diapo 35, Fiche R</w:t>
+              <w:t>Diapo 36, Fiche R</w:t>
             </w:r>
           </w:p>
         </w:tc>
@@ -1586,7 +1585,7 @@
           </w:tcPr>
           <w:p>
             <w:r>
-              <w:t>Diapos 36-43</w:t>
+              <w:t>Diapos 37-44</w:t>
             </w:r>
           </w:p>
         </w:tc>
@@ -1624,7 +1623,6 @@
                 <w:b/>
                 <w:bCs/>
               </w:rPr>
-              <w:lastRenderedPageBreak/>
               <w:t>11h15</w:t>
             </w:r>
           </w:p>
@@ -1691,7 +1689,7 @@
           </w:tcPr>
           <w:p>
             <w:r>
-              <w:t>Diapo 44, Fiche 1</w:t>
+              <w:t>Diapo 45, Fiche 1</w:t>
             </w:r>
           </w:p>
         </w:tc>
@@ -1869,7 +1867,7 @@
           </w:tcPr>
           <w:p>
             <w:r>
-              <w:t>Définition du RAG (diapo 46), schéma, maquette, 6 étapes, sources, questions, Studio, limites.</w:t>
+              <w:t>Définition du RAG (diapo 47), schéma, maquette, 6 étapes, sources, questions, Studio, limites.</w:t>
             </w:r>
           </w:p>
         </w:tc>
@@ -1891,7 +1889,7 @@
           </w:tcPr>
           <w:p>
             <w:r>
-              <w:t>Diapos 45-54</w:t>
+              <w:t>Diapos 46-55</w:t>
             </w:r>
           </w:p>
         </w:tc>
@@ -1973,7 +1971,7 @@
           </w:tcPr>
           <w:p>
             <w:r>
-              <w:t>Carnet avec les PDF de chacune ; pack commun en repli (diapo 55, clés USB). Faire vérifier 3 cases de la matrice et tester le piège.</w:t>
+              <w:t>Carnet avec les PDF de chacune ; pack commun en repli (diapo 56, clés USB). Faire vérifier 3 cases de la matrice et tester le piège.</w:t>
             </w:r>
           </w:p>
         </w:tc>
@@ -1995,7 +1993,7 @@
           </w:tcPr>
           <w:p>
             <w:r>
-              <w:t>Diapos 55-56, Fiche 2</w:t>
+              <w:t>Diapos 56-57, Fiche 2</w:t>
             </w:r>
           </w:p>
         </w:tc>
@@ -2077,7 +2075,7 @@
           </w:tcPr>
           <w:p>
             <w:r>
-              <w:t>Diapos 57-58, puis 2e carnet avec les entretiens fictifs, codage manuel AVANT l'IA. Mise en commun.</w:t>
+              <w:t>Diapos 58-59, puis 2e carnet avec les entretiens fictifs, codage manuel AVANT l'IA. Mise en commun.</w:t>
             </w:r>
           </w:p>
         </w:tc>
@@ -2099,7 +2097,7 @@
           </w:tcPr>
           <w:p>
             <w:r>
-              <w:t>Diapos 57-60, Fiche 3</w:t>
+              <w:t>Diapos 58-61, Fiche 3</w:t>
             </w:r>
           </w:p>
         </w:tc>
@@ -2299,7 +2297,7 @@
           </w:tcPr>
           <w:p>
             <w:r>
-              <w:t>Diapos 61-64</w:t>
+              <w:t>Diapos 62-65</w:t>
             </w:r>
           </w:p>
         </w:tc>
@@ -2403,7 +2401,7 @@
           </w:tcPr>
           <w:p>
             <w:r>
-              <w:t>Diapo 65, Fiche 4</w:t>
+              <w:t>Diapo 66, Fiche 4</w:t>
             </w:r>
           </w:p>
         </w:tc>
@@ -2485,7 +2483,7 @@
           </w:tcPr>
           <w:p>
             <w:r>
-              <w:t>IA agentique : définition, boucle (diapo 68), démo applye.io, agents accessibles, autonomie, garde-fous.</w:t>
+              <w:t>IA agentique : définition, boucle (diapo 69), démo applye.io, agents accessibles, autonomie, garde-fous.</w:t>
             </w:r>
           </w:p>
         </w:tc>
@@ -2507,7 +2505,7 @@
           </w:tcPr>
           <w:p>
             <w:r>
-              <w:t>Diapos 66-73</w:t>
+              <w:t>Diapos 67-74</w:t>
             </w:r>
           </w:p>
         </w:tc>
@@ -2611,7 +2609,7 @@
           </w:tcPr>
           <w:p>
             <w:r>
-              <w:t>Diapos 74-75, Fiche 5</w:t>
+              <w:t>Diapos 75-76, Fiche 5</w:t>
             </w:r>
           </w:p>
         </w:tc>
@@ -2693,7 +2691,7 @@
           </w:tcPr>
           <w:p>
             <w:r>
-              <w:t>5 réflexes, consignes du J5, liens utiles, ramassage ou photo des fiches.</w:t>
+              <w:t>Réponses du quiz (diapo 77), 5 réflexes, consignes du J5, liens utiles, ramassage ou photo des fiches.</w:t>
             </w:r>
           </w:p>
         </w:tc>
@@ -2715,7 +2713,7 @@
           </w:tcPr>
           <w:p>
             <w:r>
-              <w:t>Diapos 76-79</w:t>
+              <w:t>Diapos 77-81</w:t>
             </w:r>
           </w:p>
         </w:tc>
@@ -2727,7 +2725,6 @@
         <w:pageBreakBefore/>
       </w:pPr>
       <w:r>
-        <w:lastRenderedPageBreak/>
         <w:t>3. Corrigés et points d'attention</w:t>
       </w:r>
     </w:p>
@@ -3180,7 +3177,6 @@
                 <w:b/>
                 <w:bCs/>
               </w:rPr>
-              <w:lastRenderedPageBreak/>
               <w:t>4</w:t>
             </w:r>
           </w:p>
@@ -3850,7 +3846,6 @@
           <w:iCs/>
           <w:color w:val="6B7C82"/>
         </w:rPr>
-        <w:lastRenderedPageBreak/>
         <w:t>Résumé de référence (250 mots environ), fidèle au brouillon. Toute version fidèle et bien structurée est valable.</w:t>
       </w:r>
     </w:p>
@@ -4034,7 +4029,6 @@
         </w:numPr>
       </w:pPr>
       <w:r>
-        <w:lastRenderedPageBreak/>
         <w:t>« Plus contaminés que les autres » : aucune donnée chiffrée ni test statistique pour appuyer la comparaison.</w:t>
       </w:r>
     </w:p>
@@ -4140,11 +4134,7 @@
         <w:t>Contexte : dans les quartiers périurbains de Lomé, de nombreux ménages consomment l'eau de puits, souvent proches des latrines. Objectif : évaluer la qualité physico-chimique et bactériologique de cette eau. Méthodes : 40 puits de deux quartiers ont été échantillonnés en saison sèche (février 2025) et en saison des pluies (juin 2025) ; pH, conductivité, nitrates et coliformes fécaux ont été mesurés, ainsi que la distance à la latrine la plus proche. Résultats : les eaux étaient acides (pH moyen 5,8). La ten</w:t>
       </w:r>
       <w:r>
-        <w:t xml:space="preserve">eur moyenne en nitrates atteignait 62 mg/L et 55 % des puits dépassaient la valeur guide de l'OMS (50 </w:t>
-      </w:r>
-      <w:r>
-        <w:lastRenderedPageBreak/>
-        <w:t>mg/L). Des coliformes fécaux étaient présents dans 85 % des puits en saison des pluies et 60 % en saison sèche. Les puits situés à moins de 15 m d'une latrine apparaissaient plus contaminés [comparaison à étayer statistiquement]. Conclusion : l'eau des puits étudiés présente des risques sanitaires importants. La chloration à domicile, une distance minimale entre puits et latrines et la sensibilisation des m</w:t>
+        <w:t>eur moyenne en nitrates atteignait 62 mg/L et 55 % des puits dépassaient la valeur guide de l'OMS (50 mg/L). Des coliformes fécaux étaient présents dans 85 % des puits en saison des pluies et 60 % en saison sèche. Les puits situés à moins de 15 m d'une latrine apparaissaient plus contaminés [comparaison à étayer statistiquement]. Conclusion : l'eau des puits étudiés présente des risques sanitaires importants. La chloration à domicile, une distance minimale entre puits et latrines et la sensibilisation des m</w:t>
       </w:r>
       <w:r>
         <w:t>énages sont recommandées.</w:t>
@@ -4538,7 +4528,6 @@
                 <w:b/>
                 <w:bCs/>
               </w:rPr>
-              <w:lastRenderedPageBreak/>
               <w:t>Croisée : quelle part des chercheurs en STEM en Afrique sont des femmes ?</w:t>
             </w:r>
           </w:p>
@@ -4932,7 +4921,6 @@
         <w:pStyle w:val="Titre3"/>
       </w:pPr>
       <w:r>
-        <w:lastRenderedPageBreak/>
         <w:t>Rapports par piste (pour aller plus loin) : réponses attendues</w:t>
       </w:r>
     </w:p>
@@ -5511,7 +5499,6 @@
         <w:pStyle w:val="Titre2"/>
       </w:pPr>
       <w:r>
-        <w:lastRenderedPageBreak/>
         <w:t>Lab 3 · Analyse qualitative : thèmes attendus</w:t>
       </w:r>
     </w:p>
@@ -6473,7 +6460,6 @@
                 <w:b/>
                 <w:bCs/>
               </w:rPr>
-              <w:lastRenderedPageBreak/>
               <w:t>Relation soignant-soigné et éducation thérapeutique</w:t>
             </w:r>
           </w:p>
@@ -7217,7 +7203,6 @@
         </w:numPr>
       </w:pPr>
       <w:r>
-        <w:lastRenderedPageBreak/>
         <w:t>Les croyances reprises comme des faits : A1 (« le lait nettoie ») ne doit pas être présenté comme une pratique efficace.</w:t>
       </w:r>
     </w:p>
@@ -8515,7 +8500,6 @@
                 <w:b/>
                 <w:bCs/>
               </w:rPr>
-              <w:lastRenderedPageBreak/>
               <w:t>coliformes fécaux</w:t>
             </w:r>
           </w:p>
@@ -8978,7 +8962,6 @@
         <w:pageBreakBefore/>
       </w:pPr>
       <w:r>
-        <w:lastRenderedPageBreak/>
         <w:t>4. Grille d'évaluation des fiches</w:t>
       </w:r>
     </w:p>
@@ -9863,7 +9846,6 @@
         <w:pageBreakBefore/>
       </w:pPr>
       <w:r>
-        <w:lastRenderedPageBreak/>
         <w:t>5. Plan B</w:t>
       </w:r>
     </w:p>
@@ -10383,7 +10365,6 @@
         <w:pageBreakBefore/>
       </w:pPr>
       <w:r>
-        <w:lastRenderedPageBreak/>
         <w:t>Annexe · Quiz d'ouverture (vrai ou faux)</w:t>
       </w:r>
     </w:p>
@@ -10394,7 +10375,7 @@
           <w:iCs/>
           <w:color w:val="6B7C82"/>
         </w:rPr>
-        <w:t>5 minutes, à main levée, à 8h05. Ne pas corriger en détail : les réponses sont reprises pendant T1 et T2.</w:t>
+        <w:t>5 minutes, à main levée, à 8h05, projeté diapo 4 ; réponses projetées à la clôture (diapo 77). Ne pas corriger en détail : les réponses sont reprises pendant T1 et T2.</w:t>
       </w:r>
     </w:p>
     <w:tbl>
@@ -11296,213 +11277,213 @@
 <file path=word/numbering.xml><?xml version="1.0" encoding="utf-8"?>
 <w:numbering xmlns:wpc="http://schemas.microsoft.com/office/word/2010/wordprocessingCanvas" xmlns:cx="http://schemas.microsoft.com/office/drawing/2014/chartex" xmlns:cx1="http://schemas.microsoft.com/office/drawing/2015/9/8/chartex" xmlns:cx2="http://schemas.microsoft.com/office/drawing/2015/10/21/chartex" xmlns:cx3="http://schemas.microsoft.com/office/drawing/2016/5/9/chartex" xmlns:cx4="http://schemas.microsoft.com/office/drawing/2016/5/10/chartex" xmlns:cx5="http://schemas.microsoft.com/office/drawing/2016/5/11/chartex" xmlns:cx6="http://schemas.microsoft.com/office/drawing/2016/5/12/chartex" xmlns:cx7="http://schemas.microsoft.com/office/drawing/2016/5/13/chartex" xmlns:cx8="http://schemas.microsoft.com/office/drawing/2016/5/14/chartex" xmlns:mc="http://schemas.openxmlformats.org/markup-compatibility/2006" xmlns:aink="http://schemas.microsoft.com/office/drawing/2016/ink" xmlns:am3d="http://schemas.microsoft.com/office/drawing/2017/model3d" xmlns:o="urn:schemas-microsoft-com:office:office" xmlns:oel="http://schemas.microsoft.com/office/2019/extlst" xmlns:r="http://schemas.openxmlformats.org/officeDocument/2006/relationships" xmlns:m="http://schemas.openxmlformats.org/officeDocument/2006/math" xmlns:v="urn:schemas-microsoft-com:vml" xmlns:wp14="http://schemas.microsoft.com/office/word/2010/wordprocessingDrawing" xmlns:wp="http://schemas.openxmlformats.org/drawingml/2006/wordprocessingDrawing" xmlns:w10="urn:schemas-microsoft-com:office:word" xmlns:w="http://schemas.openxmlformats.org/wordprocessingml/2006/main" xmlns:w14="http://schemas.microsoft.com/office/word/2010/wordml" xmlns:w15="http://schemas.microsoft.com/office/word/2012/wordml" xmlns:w16cex="http://schemas.microsoft.com/office/word/2018/wordml/cex" xmlns:w16cid="http://schemas.microsoft.com/office/word/2016/wordml/cid" xmlns:w16="http://schemas.microsoft.com/office/word/2018/wordml" xmlns:w16du="http://schemas.microsoft.com/office/word/2023/wordml/word16du" xmlns:w16sdtdh="http://schemas.microsoft.com/office/word/2020/wordml/sdtdatahash" xmlns:w16sdtfl="http://schemas.microsoft.com/office/word/2024/wordml/sdtformatlock" xmlns:w16se="http://schemas.microsoft.com/office/word/2015/wordml/symex" xmlns:wpg="http://schemas.microsoft.com/office/word/2010/wordprocessingGroup" xmlns:wpi="http://schemas.microsoft.com/office/word/2010/wordprocessingInk" xmlns:wne="http://schemas.microsoft.com/office/word/2006/wordml" xmlns:wps="http://schemas.microsoft.com/office/word/2010/wordprocessingShape" mc:Ignorable="w14 w15 w16se w16cid w16 w16cex w16sdtdh w16sdtfl w16du wp14">
   <w:abstractNum w:abstractNumId="0" w15:restartNumberingAfterBreak="0">
-    <w:nsid w:val="60DF24E5"/>
+    <w:nsid w:val="09DF5047"/>
     <w:multiLevelType w:val="hybridMultilevel"/>
-    <w:tmpl w:val="540A9798"/>
-    <w:lvl w:ilvl="0" w:tplc="36CC79C2">
+    <w:tmpl w:val="D7AA3C62"/>
+    <w:lvl w:ilvl="0" w:tplc="FA681D9C">
       <w:start w:val="1"/>
-      <w:numFmt w:val="bullet"/>
-      <w:lvlText w:val="●"/>
+      <w:numFmt w:val="decimal"/>
+      <w:lvlText w:val="%1."/>
       <w:lvlJc w:val="left"/>
       <w:pPr>
-        <w:ind w:left="720" w:hanging="360"/>
+        <w:ind w:left="540" w:hanging="300"/>
       </w:pPr>
     </w:lvl>
-    <w:lvl w:ilvl="1" w:tplc="742E6A7A">
-      <w:start w:val="1"/>
-      <w:numFmt w:val="bullet"/>
-      <w:lvlText w:val="○"/>
-      <w:lvlJc w:val="left"/>
-      <w:pPr>
-        <w:ind w:left="1440" w:hanging="360"/>
-      </w:pPr>
-    </w:lvl>
-    <w:lvl w:ilvl="2" w:tplc="6BC4BFE2">
-      <w:start w:val="1"/>
-      <w:numFmt w:val="bullet"/>
-      <w:lvlText w:val="■"/>
-      <w:lvlJc w:val="left"/>
-      <w:pPr>
-        <w:ind w:left="2160" w:hanging="360"/>
-      </w:pPr>
-    </w:lvl>
-    <w:lvl w:ilvl="3" w:tplc="D618F26C">
-      <w:start w:val="1"/>
-      <w:numFmt w:val="bullet"/>
-      <w:lvlText w:val="●"/>
-      <w:lvlJc w:val="left"/>
-      <w:pPr>
-        <w:ind w:left="2880" w:hanging="360"/>
-      </w:pPr>
-    </w:lvl>
-    <w:lvl w:ilvl="4" w:tplc="CD0002DE">
-      <w:start w:val="1"/>
-      <w:numFmt w:val="bullet"/>
-      <w:lvlText w:val="○"/>
-      <w:lvlJc w:val="left"/>
-      <w:pPr>
-        <w:ind w:left="3600" w:hanging="360"/>
-      </w:pPr>
-    </w:lvl>
-    <w:lvl w:ilvl="5" w:tplc="3BF80EC4">
-      <w:start w:val="1"/>
-      <w:numFmt w:val="bullet"/>
-      <w:lvlText w:val="■"/>
-      <w:lvlJc w:val="left"/>
-      <w:pPr>
-        <w:ind w:left="4320" w:hanging="360"/>
-      </w:pPr>
-    </w:lvl>
-    <w:lvl w:ilvl="6" w:tplc="D0BEBD10">
-      <w:start w:val="1"/>
-      <w:numFmt w:val="bullet"/>
-      <w:lvlText w:val="●"/>
-      <w:lvlJc w:val="left"/>
-      <w:pPr>
-        <w:ind w:left="5040" w:hanging="360"/>
-      </w:pPr>
-    </w:lvl>
-    <w:lvl w:ilvl="7" w:tplc="91748AFC">
-      <w:start w:val="1"/>
-      <w:numFmt w:val="bullet"/>
-      <w:lvlText w:val="●"/>
-      <w:lvlJc w:val="left"/>
-      <w:pPr>
-        <w:ind w:left="5760" w:hanging="360"/>
-      </w:pPr>
-    </w:lvl>
-    <w:lvl w:ilvl="8" w:tplc="82A80394">
-      <w:start w:val="1"/>
-      <w:numFmt w:val="bullet"/>
-      <w:lvlText w:val="●"/>
-      <w:lvlJc w:val="left"/>
-      <w:pPr>
-        <w:ind w:left="6480" w:hanging="360"/>
-      </w:pPr>
-    </w:lvl>
-  </w:abstractNum>
-  <w:abstractNum w:abstractNumId="1" w15:restartNumberingAfterBreak="0">
-    <w:nsid w:val="63836EBE"/>
-    <w:multiLevelType w:val="hybridMultilevel"/>
-    <w:tmpl w:val="928A2E54"/>
-    <w:lvl w:ilvl="0" w:tplc="AA6EF2C2">
-      <w:start w:val="1"/>
-      <w:numFmt w:val="bullet"/>
-      <w:lvlText w:val="•"/>
-      <w:lvlJc w:val="left"/>
-      <w:pPr>
-        <w:ind w:left="540" w:hanging="270"/>
-      </w:pPr>
-    </w:lvl>
-    <w:lvl w:ilvl="1" w:tplc="B630CD5A">
+    <w:lvl w:ilvl="1" w:tplc="4FE20914">
       <w:numFmt w:val="decimal"/>
       <w:lvlText w:val=""/>
       <w:lvlJc w:val="left"/>
     </w:lvl>
-    <w:lvl w:ilvl="2" w:tplc="8C18D8AA">
+    <w:lvl w:ilvl="2" w:tplc="C360E344">
       <w:numFmt w:val="decimal"/>
       <w:lvlText w:val=""/>
       <w:lvlJc w:val="left"/>
     </w:lvl>
-    <w:lvl w:ilvl="3" w:tplc="7B5855D6">
+    <w:lvl w:ilvl="3" w:tplc="6B32D032">
       <w:numFmt w:val="decimal"/>
       <w:lvlText w:val=""/>
       <w:lvlJc w:val="left"/>
     </w:lvl>
-    <w:lvl w:ilvl="4" w:tplc="79008F7A">
+    <w:lvl w:ilvl="4" w:tplc="9EBACB7A">
       <w:numFmt w:val="decimal"/>
       <w:lvlText w:val=""/>
       <w:lvlJc w:val="left"/>
     </w:lvl>
-    <w:lvl w:ilvl="5" w:tplc="D2AE0D12">
+    <w:lvl w:ilvl="5" w:tplc="BB728622">
       <w:numFmt w:val="decimal"/>
       <w:lvlText w:val=""/>
       <w:lvlJc w:val="left"/>
     </w:lvl>
-    <w:lvl w:ilvl="6" w:tplc="BB32E860">
+    <w:lvl w:ilvl="6" w:tplc="367A3B06">
       <w:numFmt w:val="decimal"/>
       <w:lvlText w:val=""/>
       <w:lvlJc w:val="left"/>
     </w:lvl>
-    <w:lvl w:ilvl="7" w:tplc="5066EB58">
+    <w:lvl w:ilvl="7" w:tplc="B7F025B0">
       <w:numFmt w:val="decimal"/>
       <w:lvlText w:val=""/>
       <w:lvlJc w:val="left"/>
     </w:lvl>
-    <w:lvl w:ilvl="8" w:tplc="2668CDEE">
+    <w:lvl w:ilvl="8" w:tplc="24040AB2">
       <w:numFmt w:val="decimal"/>
       <w:lvlText w:val=""/>
       <w:lvlJc w:val="left"/>
     </w:lvl>
   </w:abstractNum>
+  <w:abstractNum w:abstractNumId="1" w15:restartNumberingAfterBreak="0">
+    <w:nsid w:val="183B3A0D"/>
+    <w:multiLevelType w:val="hybridMultilevel"/>
+    <w:tmpl w:val="68889B4E"/>
+    <w:lvl w:ilvl="0" w:tplc="68CE11CE">
+      <w:start w:val="1"/>
+      <w:numFmt w:val="bullet"/>
+      <w:lvlText w:val="●"/>
+      <w:lvlJc w:val="left"/>
+      <w:pPr>
+        <w:ind w:left="720" w:hanging="360"/>
+      </w:pPr>
+    </w:lvl>
+    <w:lvl w:ilvl="1" w:tplc="7238283A">
+      <w:start w:val="1"/>
+      <w:numFmt w:val="bullet"/>
+      <w:lvlText w:val="○"/>
+      <w:lvlJc w:val="left"/>
+      <w:pPr>
+        <w:ind w:left="1440" w:hanging="360"/>
+      </w:pPr>
+    </w:lvl>
+    <w:lvl w:ilvl="2" w:tplc="97F89262">
+      <w:start w:val="1"/>
+      <w:numFmt w:val="bullet"/>
+      <w:lvlText w:val="■"/>
+      <w:lvlJc w:val="left"/>
+      <w:pPr>
+        <w:ind w:left="2160" w:hanging="360"/>
+      </w:pPr>
+    </w:lvl>
+    <w:lvl w:ilvl="3" w:tplc="1FF43D1E">
+      <w:start w:val="1"/>
+      <w:numFmt w:val="bullet"/>
+      <w:lvlText w:val="●"/>
+      <w:lvlJc w:val="left"/>
+      <w:pPr>
+        <w:ind w:left="2880" w:hanging="360"/>
+      </w:pPr>
+    </w:lvl>
+    <w:lvl w:ilvl="4" w:tplc="0AE2D954">
+      <w:start w:val="1"/>
+      <w:numFmt w:val="bullet"/>
+      <w:lvlText w:val="○"/>
+      <w:lvlJc w:val="left"/>
+      <w:pPr>
+        <w:ind w:left="3600" w:hanging="360"/>
+      </w:pPr>
+    </w:lvl>
+    <w:lvl w:ilvl="5" w:tplc="1CB6D004">
+      <w:start w:val="1"/>
+      <w:numFmt w:val="bullet"/>
+      <w:lvlText w:val="■"/>
+      <w:lvlJc w:val="left"/>
+      <w:pPr>
+        <w:ind w:left="4320" w:hanging="360"/>
+      </w:pPr>
+    </w:lvl>
+    <w:lvl w:ilvl="6" w:tplc="C41299CC">
+      <w:start w:val="1"/>
+      <w:numFmt w:val="bullet"/>
+      <w:lvlText w:val="●"/>
+      <w:lvlJc w:val="left"/>
+      <w:pPr>
+        <w:ind w:left="5040" w:hanging="360"/>
+      </w:pPr>
+    </w:lvl>
+    <w:lvl w:ilvl="7" w:tplc="BE60FD7E">
+      <w:start w:val="1"/>
+      <w:numFmt w:val="bullet"/>
+      <w:lvlText w:val="●"/>
+      <w:lvlJc w:val="left"/>
+      <w:pPr>
+        <w:ind w:left="5760" w:hanging="360"/>
+      </w:pPr>
+    </w:lvl>
+    <w:lvl w:ilvl="8" w:tplc="59B4ACA2">
+      <w:start w:val="1"/>
+      <w:numFmt w:val="bullet"/>
+      <w:lvlText w:val="●"/>
+      <w:lvlJc w:val="left"/>
+      <w:pPr>
+        <w:ind w:left="6480" w:hanging="360"/>
+      </w:pPr>
+    </w:lvl>
+  </w:abstractNum>
   <w:abstractNum w:abstractNumId="2" w15:restartNumberingAfterBreak="0">
-    <w:nsid w:val="78E2573F"/>
+    <w:nsid w:val="43956644"/>
     <w:multiLevelType w:val="hybridMultilevel"/>
-    <w:tmpl w:val="A2CC10E4"/>
-    <w:lvl w:ilvl="0" w:tplc="81C844C8">
+    <w:tmpl w:val="0DAE162C"/>
+    <w:lvl w:ilvl="0" w:tplc="E72C1AC6">
       <w:start w:val="1"/>
-      <w:numFmt w:val="decimal"/>
-      <w:lvlText w:val="%1."/>
+      <w:numFmt w:val="bullet"/>
+      <w:lvlText w:val="•"/>
       <w:lvlJc w:val="left"/>
       <w:pPr>
-        <w:ind w:left="540" w:hanging="300"/>
+        <w:ind w:left="540" w:hanging="270"/>
       </w:pPr>
     </w:lvl>
-    <w:lvl w:ilvl="1" w:tplc="4300A2CE">
+    <w:lvl w:ilvl="1" w:tplc="8EAE2810">
       <w:numFmt w:val="decimal"/>
       <w:lvlText w:val=""/>
       <w:lvlJc w:val="left"/>
     </w:lvl>
-    <w:lvl w:ilvl="2" w:tplc="68C82B12">
+    <w:lvl w:ilvl="2" w:tplc="6B368622">
       <w:numFmt w:val="decimal"/>
       <w:lvlText w:val=""/>
       <w:lvlJc w:val="left"/>
     </w:lvl>
-    <w:lvl w:ilvl="3" w:tplc="B2D62B7E">
+    <w:lvl w:ilvl="3" w:tplc="42E4789C">
       <w:numFmt w:val="decimal"/>
       <w:lvlText w:val=""/>
       <w:lvlJc w:val="left"/>
     </w:lvl>
-    <w:lvl w:ilvl="4" w:tplc="F350DABA">
+    <w:lvl w:ilvl="4" w:tplc="719E4ADC">
       <w:numFmt w:val="decimal"/>
       <w:lvlText w:val=""/>
       <w:lvlJc w:val="left"/>
     </w:lvl>
-    <w:lvl w:ilvl="5" w:tplc="B25E3284">
+    <w:lvl w:ilvl="5" w:tplc="6D2C8FCA">
       <w:numFmt w:val="decimal"/>
       <w:lvlText w:val=""/>
       <w:lvlJc w:val="left"/>
     </w:lvl>
-    <w:lvl w:ilvl="6" w:tplc="4216D818">
+    <w:lvl w:ilvl="6" w:tplc="A0BCB5EE">
       <w:numFmt w:val="decimal"/>
       <w:lvlText w:val=""/>
       <w:lvlJc w:val="left"/>
     </w:lvl>
-    <w:lvl w:ilvl="7" w:tplc="C588AA44">
+    <w:lvl w:ilvl="7" w:tplc="1C7055A4">
       <w:numFmt w:val="decimal"/>
       <w:lvlText w:val=""/>
       <w:lvlJc w:val="left"/>
     </w:lvl>
-    <w:lvl w:ilvl="8" w:tplc="A7722CD0">
+    <w:lvl w:ilvl="8" w:tplc="DFF4395E">
       <w:numFmt w:val="decimal"/>
       <w:lvlText w:val=""/>
       <w:lvlJc w:val="left"/>
     </w:lvl>
   </w:abstractNum>
-  <w:num w:numId="1" w16cid:durableId="228344534">
+  <w:num w:numId="1" w16cid:durableId="700663637">
+    <w:abstractNumId w:val="1"/>
+    <w:lvlOverride w:ilvl="0">
+      <w:startOverride w:val="1"/>
+    </w:lvlOverride>
+  </w:num>
+  <w:num w:numId="2" w16cid:durableId="1083145131">
     <w:abstractNumId w:val="0"/>
     <w:lvlOverride w:ilvl="0">
       <w:startOverride w:val="1"/>
     </w:lvlOverride>
   </w:num>
-  <w:num w:numId="2" w16cid:durableId="359281305">
+  <w:num w:numId="3" w16cid:durableId="58020722">
     <w:abstractNumId w:val="2"/>
-    <w:lvlOverride w:ilvl="0">
-      <w:startOverride w:val="1"/>
-    </w:lvlOverride>
-  </w:num>
-  <w:num w:numId="3" w16cid:durableId="2021816053">
-    <w:abstractNumId w:val="1"/>
     <w:lvlOverride w:ilvl="0">
       <w:startOverride w:val="1"/>
     </w:lvlOverride>

</xml_diff>